<commit_message>
Actualización del modelo de dominio. Faltan los modelos de flujo
</commit_message>
<xml_diff>
--- a/A-Documentacion/1-AnalisisDominio/eGraduados_ModeloDominio.docx
+++ b/A-Documentacion/1-AnalisisDominio/eGraduados_ModeloDominio.docx
@@ -6,8 +6,11 @@
       <w:sdtPr>
         <w:rPr>
           <w:rFonts w:asciiTheme="majorHAnsi" w:eastAsiaTheme="majorEastAsia" w:hAnsiTheme="majorHAnsi" w:cstheme="majorBidi"/>
+          <w:i/>
+          <w:color w:val="548DD4"/>
           <w:sz w:val="72"/>
           <w:szCs w:val="72"/>
+          <w:lang w:val="es-AR"/>
         </w:rPr>
         <w:id w:val="3224277"/>
         <w:docPartObj>
@@ -18,11 +21,8 @@
       <w:sdtEndPr>
         <w:rPr>
           <w:rFonts w:asciiTheme="minorHAnsi" w:eastAsiaTheme="minorHAnsi" w:hAnsiTheme="minorHAnsi" w:cstheme="minorBidi"/>
-          <w:i/>
-          <w:color w:val="548DD4"/>
           <w:sz w:val="22"/>
           <w:szCs w:val="22"/>
-          <w:lang w:val="es-AR"/>
         </w:rPr>
       </w:sdtEndPr>
       <w:sdtContent>
@@ -155,6 +155,7 @@
                   <w:szCs w:val="36"/>
                 </w:rPr>
               </w:pPr>
+              <w:proofErr w:type="spellStart"/>
               <w:r>
                 <w:rPr>
                   <w:rFonts w:asciiTheme="majorHAnsi" w:eastAsiaTheme="majorEastAsia" w:hAnsiTheme="majorHAnsi" w:cstheme="majorBidi"/>
@@ -163,6 +164,7 @@
                 </w:rPr>
                 <w:t>eGraduados</w:t>
               </w:r>
+              <w:proofErr w:type="spellEnd"/>
             </w:p>
           </w:sdtContent>
         </w:sdt>
@@ -2057,25 +2059,62 @@
         <w:pStyle w:val="PSI-Normal"/>
       </w:pPr>
       <w:r>
-        <w:t>Para la creación de un analítico, el graduado debe completar un formulario de Google Forms</w:t>
-      </w:r>
+        <w:t xml:space="preserve">Para la creación de un analítico, el graduado debe completar un formulario de Google </w:t>
+      </w:r>
+      <w:proofErr w:type="spellStart"/>
+      <w:r>
+        <w:t>Forms</w:t>
+      </w:r>
+      <w:proofErr w:type="spellEnd"/>
       <w:r>
         <w:t xml:space="preserve"> llamado “Solicitud de Título”,</w:t>
       </w:r>
       <w:r>
-        <w:t xml:space="preserve"> para realizar la solicitud de creación del analítico. Este Google Forms le solicita al graduado: Correo electrónico, legajo, apellido/s, nombre/s, domicilio actual, carrera de la cuál se gradúa, fecha de ingreso a la carrera, fecha de egreso de la carrera, promedio </w:t>
+        <w:t xml:space="preserve"> para realizar la solicitud de creación del analítico. Este Google </w:t>
+      </w:r>
+      <w:proofErr w:type="spellStart"/>
+      <w:r>
+        <w:t>Forms</w:t>
+      </w:r>
+      <w:proofErr w:type="spellEnd"/>
+      <w:r>
+        <w:t xml:space="preserve"> le solicita al graduado: Correo electrónico, legajo, apellido/s, nombre/s, domicilio actual, carrera de la </w:t>
+      </w:r>
+      <w:proofErr w:type="spellStart"/>
+      <w:r>
+        <w:t>cuál</w:t>
+      </w:r>
+      <w:proofErr w:type="spellEnd"/>
+      <w:r>
+        <w:t xml:space="preserve"> se gradúa, fecha de ingreso a la carrera, fecha de egreso de la carrera, promedio </w:t>
       </w:r>
       <w:r>
         <w:t>CON</w:t>
       </w:r>
       <w:r>
-        <w:t xml:space="preserve"> aplazos (del SIU GUARANI3W), promedio </w:t>
+        <w:t xml:space="preserve"> </w:t>
+      </w:r>
+      <w:proofErr w:type="spellStart"/>
+      <w:r>
+        <w:t>aplazos</w:t>
+      </w:r>
+      <w:proofErr w:type="spellEnd"/>
+      <w:r>
+        <w:t xml:space="preserve"> (del SIU GUARANI3W), promedio </w:t>
       </w:r>
       <w:r>
         <w:t>SIN</w:t>
       </w:r>
       <w:r>
-        <w:t xml:space="preserve"> aplazos </w:t>
+        <w:t xml:space="preserve"> </w:t>
+      </w:r>
+      <w:proofErr w:type="spellStart"/>
+      <w:r>
+        <w:t>aplazos</w:t>
+      </w:r>
+      <w:proofErr w:type="spellEnd"/>
+      <w:r>
+        <w:t xml:space="preserve"> </w:t>
       </w:r>
       <w:r>
         <w:t xml:space="preserve">(del SIU GUARANI3W), fecha de ingreso a la carrera, fecha de ingreso a la institución, fecha de egreso de la carrera, teléfono de contacto, archivo PDF de la Nota de Solicitud y Juramento, archivo PDF de Libre deuda de Biblioteca, archivo PDF del certificado analítico secundario/polimodal, archivo PDF de acta de nacimiento, archivo PDF de fotocopia de DNI certificado por Juez de Paz, escribano </w:t>
@@ -2096,7 +2135,15 @@
         <w:t>s</w:t>
       </w:r>
       <w:r>
-        <w:t xml:space="preserve"> vinculado al formulario de Solicitud de Título, además de que los archivos PDF son enviados a las carpetas generadas automáticamente por Google Forms. En estas carpetas, cada tipo de archivo tiene su carpeta correspondiente como organización predeterminada. </w:t>
+        <w:t xml:space="preserve"> vinculado al formulario de Solicitud de Título, además de que los archivos PDF son enviados a las carpetas generadas automáticamente por Google </w:t>
+      </w:r>
+      <w:proofErr w:type="spellStart"/>
+      <w:r>
+        <w:t>Forms</w:t>
+      </w:r>
+      <w:proofErr w:type="spellEnd"/>
+      <w:r>
+        <w:t xml:space="preserve">. En estas carpetas, cada tipo de archivo tiene su carpeta correspondiente como organización predeterminada. </w:t>
       </w:r>
     </w:p>
     <w:p>
@@ -2112,10 +2159,7 @@
         <w:pStyle w:val="PSI-Normal"/>
       </w:pPr>
       <w:r>
-        <w:t xml:space="preserve">También, para completar el apartado de materias aprobadas y exámenes rendidos, se </w:t>
-      </w:r>
-      <w:r>
-        <w:t xml:space="preserve">debe </w:t>
+        <w:t xml:space="preserve">También, para completar el apartado de materias aprobadas y exámenes rendidos, se debe </w:t>
       </w:r>
       <w:r>
         <w:t>descargar</w:t>
@@ -2124,7 +2168,15 @@
         <w:t xml:space="preserve">, mediante </w:t>
       </w:r>
       <w:r>
-        <w:t>la aplicación de AnyDesk conectada a una computadora remota que posee un acceso restringido (vista y descarga) al</w:t>
+        <w:t xml:space="preserve">la aplicación de </w:t>
+      </w:r>
+      <w:proofErr w:type="spellStart"/>
+      <w:r>
+        <w:t>AnyDesk</w:t>
+      </w:r>
+      <w:proofErr w:type="spellEnd"/>
+      <w:r>
+        <w:t xml:space="preserve"> conectada a una computadora remota que posee un acceso restringido (vista y descarga) al</w:t>
       </w:r>
       <w:r>
         <w:t xml:space="preserve"> SIU GUARANI3W</w:t>
@@ -2168,11 +2220,24 @@
         <w:t>r</w:t>
       </w:r>
       <w:r>
-        <w:t xml:space="preserve"> de forma manual el promedio SIN aplazos, ya que el promedio (con o sin aplazo</w:t>
+        <w:t xml:space="preserve"> de forma manual el promedio SIN </w:t>
+      </w:r>
+      <w:proofErr w:type="spellStart"/>
+      <w:r>
+        <w:t>aplazos</w:t>
+      </w:r>
+      <w:proofErr w:type="spellEnd"/>
+      <w:r>
+        <w:t xml:space="preserve">, ya que el promedio (con o sin </w:t>
+      </w:r>
+      <w:proofErr w:type="spellStart"/>
+      <w:r>
+        <w:t>aplazo</w:t>
       </w:r>
       <w:r>
         <w:t>s</w:t>
       </w:r>
+      <w:proofErr w:type="spellEnd"/>
       <w:r>
         <w:t xml:space="preserve">) obtenido del SIU GUARANI3W </w:t>
       </w:r>
@@ -2192,11 +2257,16 @@
         <w:t xml:space="preserve"> asignaturas</w:t>
       </w:r>
       <w:r>
-        <w:t>, no son contempladas al momento de realizar el analítico ni calcular el promedio (con o sin aplazo</w:t>
+        <w:t xml:space="preserve">, no son contempladas al momento de realizar el analítico ni calcular el promedio (con o sin </w:t>
+      </w:r>
+      <w:proofErr w:type="spellStart"/>
+      <w:r>
+        <w:t>aplazo</w:t>
       </w:r>
       <w:r>
         <w:t>s</w:t>
       </w:r>
+      <w:proofErr w:type="spellEnd"/>
       <w:r>
         <w:t>).</w:t>
       </w:r>
@@ -2325,8 +2395,13 @@
         <w:t xml:space="preserve"> directo</w:t>
       </w:r>
       <w:r>
-        <w:t xml:space="preserve"> para obtener el promedio, con o sin aplazos</w:t>
-      </w:r>
+        <w:t xml:space="preserve"> para obtener el promedio, con o sin </w:t>
+      </w:r>
+      <w:proofErr w:type="spellStart"/>
+      <w:r>
+        <w:t>aplazos</w:t>
+      </w:r>
+      <w:proofErr w:type="spellEnd"/>
       <w:r>
         <w:t xml:space="preserve">. </w:t>
       </w:r>
@@ -2343,10 +2418,31 @@
         <w:t xml:space="preserve">El entorno SIU GUARANI3W no permite descargar historias académicas ni otros documentos en </w:t>
       </w:r>
       <w:r>
-        <w:t>formato .xlxs</w:t>
-      </w:r>
-      <w:r>
-        <w:t xml:space="preserve"> o .csv, ya que el PDF CREATOR 4.2.0 se encuentra orientado a la generación de PDFs, además de que el SIU GUARANI3W se encuentra orientado a la vi</w:t>
+        <w:t>formato .</w:t>
+      </w:r>
+      <w:proofErr w:type="spellStart"/>
+      <w:r>
+        <w:t>xlxs</w:t>
+      </w:r>
+      <w:proofErr w:type="spellEnd"/>
+      <w:r>
+        <w:t xml:space="preserve"> o .</w:t>
+      </w:r>
+      <w:proofErr w:type="spellStart"/>
+      <w:r>
+        <w:t>csv</w:t>
+      </w:r>
+      <w:proofErr w:type="spellEnd"/>
+      <w:r>
+        <w:t xml:space="preserve">, ya que el PDF CREATOR 4.2.0 se encuentra orientado a la generación de </w:t>
+      </w:r>
+      <w:proofErr w:type="spellStart"/>
+      <w:r>
+        <w:t>PDFs</w:t>
+      </w:r>
+      <w:proofErr w:type="spellEnd"/>
+      <w:r>
+        <w:t>, además de que el SIU GUARANI3W se encuentra orientado a la vi</w:t>
       </w:r>
       <w:r>
         <w:t>sualización de documentos, por lo que la estructura de los archivos no son un insumo de alta calidad para la transformación directa a formatos de hojas de cálculo.</w:t>
@@ -2371,7 +2467,15 @@
         <w:t xml:space="preserve">Para la obtención de un promedio histórico por carrera, el Departamento de Títulos ingresa a Google Drive, su principal repositorio, para ver uno a uno los analíticos emitidos correspondientes a cada carrera. De cada analítico se extrae: nombre y apellido del graduado, año de egreso y el promedio SIN aplazo, </w:t>
       </w:r>
       <w:r>
-        <w:t xml:space="preserve">lo cuál se traspasa a un Google Sheets de Graduados por carrera. </w:t>
+        <w:t xml:space="preserve">lo </w:t>
+      </w:r>
+      <w:proofErr w:type="spellStart"/>
+      <w:r>
+        <w:t>cuál</w:t>
+      </w:r>
+      <w:proofErr w:type="spellEnd"/>
+      <w:r>
+        <w:t xml:space="preserve"> se traspasa a un Google Sheets de Graduados por carrera. </w:t>
       </w:r>
     </w:p>
     <w:p>
@@ -2379,7 +2483,15 @@
         <w:pStyle w:val="PSI-Normal"/>
       </w:pPr>
       <w:r>
-        <w:t xml:space="preserve">Al momento en el que se solicita el promedio histórico de una carrera, se utilizan los Google Sheets de graduados por carrera, y se realiza el promedio en base a los promedios SIN aplazos de los graduados de los últimos cinco (5) años.  </w:t>
+        <w:t xml:space="preserve">Al momento en el que se solicita el promedio histórico de una carrera, se utilizan los Google Sheets de graduados por carrera, y se realiza el promedio en base a los promedios SIN </w:t>
+      </w:r>
+      <w:proofErr w:type="spellStart"/>
+      <w:r>
+        <w:t>aplazos</w:t>
+      </w:r>
+      <w:proofErr w:type="spellEnd"/>
+      <w:r>
+        <w:t xml:space="preserve"> de los graduados de los últimos cinco (5) años.  </w:t>
       </w:r>
     </w:p>
     <w:p>
@@ -2415,8 +2527,57 @@
         </w:numPr>
       </w:pPr>
       <w:r>
-        <w:t>Se emplean distintas hojas de cálculo para l</w:t>
-      </w:r>
+        <w:t xml:space="preserve">Se emplean distintas hojas de cálculo para </w:t>
+      </w:r>
+      <w:r>
+        <w:t>el cálculo de los promedios históricos</w:t>
+      </w:r>
+    </w:p>
+    <w:p>
+      <w:pPr>
+        <w:pStyle w:val="PSI-Normal"/>
+        <w:numPr>
+          <w:ilvl w:val="0"/>
+          <w:numId w:val="15"/>
+        </w:numPr>
+      </w:pPr>
+      <w:r>
+        <w:t>Las hojas de cálculo se encuentran incompletas y a veces con resultados inconsistentes y duplicados</w:t>
+      </w:r>
+    </w:p>
+    <w:p>
+      <w:pPr>
+        <w:pStyle w:val="PSI-Normal"/>
+        <w:numPr>
+          <w:ilvl w:val="0"/>
+          <w:numId w:val="15"/>
+        </w:numPr>
+      </w:pPr>
+      <w:r>
+        <w:t>El formato de las hojas de cálculo resuelve el problema de forma práctica, pero no es escalable ni se encuentra en un formato estándar de hoja de cálculo</w:t>
+      </w:r>
+    </w:p>
+    <w:p>
+      <w:pPr>
+        <w:pStyle w:val="PSI-Normal"/>
+        <w:numPr>
+          <w:ilvl w:val="0"/>
+          <w:numId w:val="15"/>
+        </w:numPr>
+      </w:pPr>
+      <w:r>
+        <w:lastRenderedPageBreak/>
+        <w:t>El proceso utilizado actualmente requiere la transcripción a mano de cada graduado y su calificación SIN aplazo a la hoja de cálculo correspondiente</w:t>
+      </w:r>
+    </w:p>
+    <w:p>
+      <w:pPr>
+        <w:pStyle w:val="PSI-Normal"/>
+        <w:numPr>
+          <w:ilvl w:val="0"/>
+          <w:numId w:val="15"/>
+        </w:numPr>
+      </w:pPr>
     </w:p>
     <w:p>
       <w:pPr>
@@ -2464,7 +2625,6 @@
       <w:bookmarkStart w:id="47" w:name="_Toc234655075"/>
       <w:bookmarkStart w:id="48" w:name="_Toc257623444"/>
       <w:r>
-        <w:lastRenderedPageBreak/>
         <w:t>Herramientas de Apoyo</w:t>
       </w:r>
       <w:bookmarkEnd w:id="44"/>
@@ -3120,6 +3280,7 @@
         <w:text/>
       </w:sdtPr>
       <w:sdtContent>
+        <w:proofErr w:type="spellStart"/>
         <w:r>
           <w:rPr>
             <w:rFonts w:asciiTheme="majorHAnsi" w:eastAsiaTheme="majorEastAsia" w:hAnsiTheme="majorHAnsi" w:cstheme="majorBidi"/>
@@ -3127,6 +3288,7 @@
           </w:rPr>
           <w:t>eGraduados</w:t>
         </w:r>
+        <w:proofErr w:type="spellEnd"/>
       </w:sdtContent>
     </w:sdt>
     <w:r>

</xml_diff>